<commit_message>
fix(eda): split GC violin plots and update professional labels
- Decouple Donor (GT) and Acceptor (AG) in Spec 04 violin plots using subplots.
- Rename all exported figures to descriptive production-standard names.
- Update titles, axis labels, and category names to remove technical jargon.
- Synchronize DOCX report generator with new figure names and labels.
</commit_message>
<xml_diff>
--- a/Reporte.docx
+++ b/Reporte.docx
@@ -91,7 +91,7 @@
       <w:r>
         <w:drawing>
           <wp:inline xmlns:a="http://schemas.openxmlformats.org/drawingml/2006/main" xmlns:pic="http://schemas.openxmlformats.org/drawingml/2006/picture">
-            <wp:extent cx="5029200" cy="5029200"/>
+            <wp:extent cx="5029200" cy="2155371"/>
             <wp:docPr id="2" name="Picture 2"/>
             <wp:cNvGraphicFramePr>
               <a:graphicFrameLocks noChangeAspect="1"/>
@@ -112,7 +112,7 @@
                   <pic:spPr>
                     <a:xfrm>
                       <a:off x="0" y="0"/>
-                      <a:ext cx="5029200" cy="5029200"/>
+                      <a:ext cx="5029200" cy="2155371"/>
                     </a:xfrm>
                     <a:prstGeom prst="rect"/>
                   </pic:spPr>

</xml_diff>